<commit_message>
GSET: regen PDF + DOCX with 9-month removed
</commit_message>
<xml_diff>
--- a/modern-savage-strategy/gset-next-actions/GSET-Next-Physical-Actions-2026-05-13.docx
+++ b/modern-savage-strategy/gset-next-actions/GSET-Next-Physical-Actions-2026-05-13.docx
@@ -490,7 +490,7 @@
         <w:rPr>
           <w:sz w:val="22"/>
         </w:rPr>
-        <w:t>Available for ~9 months of fortnightly cuts after the shoot</w:t>
+        <w:t>Available for ongoing fortnightly cuts after the shoot (run length TBC)</w:t>
       </w:r>
     </w:p>
     <w:p>
@@ -914,7 +914,7 @@
         <w:rPr>
           <w:sz w:val="22"/>
         </w:rPr>
-        <w:t>| Editor retainer (9 months × £1.8k) | 16,200 |</w:t>
+        <w:t>| Editor retainer (£1.8k/month — total scales with run length, TBC) | 1,800/mo |</w:t>
       </w:r>
     </w:p>
     <w:p>
@@ -958,7 +958,7 @@
         <w:rPr>
           <w:sz w:val="22"/>
         </w:rPr>
-        <w:t>| Contingency 10% | 2,540 |</w:t>
+        <w:t>| Contingency 10% (on fixed lines) | 920 |</w:t>
       </w:r>
     </w:p>
     <w:p>
@@ -989,7 +989,7 @@
           <w:b/>
           <w:sz w:val="22"/>
         </w:rPr>
-        <w:t>~27,940</w:t>
+        <w:t>~10,120 + editor monthly</w:t>
       </w:r>
       <w:r>
         <w:rPr>

</xml_diff>